<commit_message>
VARIABLES DE NALISIS DE DATOS NOTEBOOK 2
</commit_message>
<xml_diff>
--- a/NOTEBOOKS/Actividad Notebook 01 – Introducción a Python.docx
+++ b/NOTEBOOKS/Actividad Notebook 01 – Introducción a Python.docx
@@ -128,7 +128,7 @@
           <w:sz w:val="28"/>
           <w:szCs w:val="20"/>
         </w:rPr>
-        <w:t>NOTEBOOK 01 - Introducción a Python</w:t>
+        <w:t>2. Segundo análisis de casos – Fundamentos de Python</w:t>
       </w:r>
     </w:p>
     <w:p>
@@ -136,6 +136,8 @@
         <w:spacing w:after="160"/>
         <w:ind w:left="0"/>
         <w:rPr>
+          <w:i/>
+          <w:iCs/>
           <w:sz w:val="28"/>
           <w:szCs w:val="20"/>
         </w:rPr>
@@ -151,10 +153,28 @@
       </w:r>
       <w:r>
         <w:rPr>
+          <w:b/>
+          <w:bCs/>
           <w:sz w:val="28"/>
           <w:szCs w:val="20"/>
         </w:rPr>
+        <w:t xml:space="preserve"> Adonis Roman Dinarte </w:t>
+      </w:r>
+      <w:r>
+        <w:rPr>
+          <w:sz w:val="28"/>
+          <w:szCs w:val="20"/>
+        </w:rPr>
         <w:br/>
+      </w:r>
+      <w:r>
+        <w:rPr>
+          <w:b/>
+          <w:bCs/>
+          <w:sz w:val="28"/>
+          <w:szCs w:val="20"/>
+        </w:rPr>
+        <w:t>URL del Repositorio Público:</w:t>
       </w:r>
       <w:r>
         <w:rPr>
@@ -163,7 +183,7 @@
           <w:sz w:val="28"/>
           <w:szCs w:val="20"/>
         </w:rPr>
-        <w:t>(Escribe tu nombre completo aquí)</w:t>
+        <w:t>)</w:t>
       </w:r>
     </w:p>
     <w:p>
@@ -176,107 +196,24 @@
         </w:rPr>
       </w:pPr>
       <w:r>
+        <w:rPr>
+          <w:sz w:val="28"/>
+          <w:szCs w:val="20"/>
+        </w:rPr>
+        <w:t>https://github.com/RomanD1995/2026C2-c03programacion/blob/main/tareas/2.%20Segundo%20an%C3%A1lisis%20de%20casos%20%E2%80%93%20Fundamentos%20de%20Python.ipynb</w:t>
+      </w:r>
+    </w:p>
+    <w:p>
+      <w:pPr>
+        <w:spacing w:after="160"/>
+        <w:ind w:left="0"/>
         <w:rPr>
           <w:b/>
           <w:bCs/>
           <w:sz w:val="28"/>
           <w:szCs w:val="20"/>
         </w:rPr>
-        <w:t>URL del Repositorio Público:</w:t>
-      </w:r>
-      <w:r>
-        <w:rPr>
-          <w:sz w:val="28"/>
-          <w:szCs w:val="20"/>
-        </w:rPr>
-        <w:br/>
-      </w:r>
-      <w:r>
-        <w:rPr>
-          <w:i/>
-          <w:iCs/>
-          <w:sz w:val="28"/>
-          <w:szCs w:val="20"/>
-        </w:rPr>
-        <w:t>(Pega aquí el enlace al repositorio público en GitHub)</w:t>
-      </w:r>
-    </w:p>
-    <w:p>
-      <w:pPr>
-        <w:spacing w:after="160"/>
-        <w:ind w:left="0"/>
-        <w:rPr>
-          <w:b/>
-          <w:bCs/>
-          <w:sz w:val="28"/>
-          <w:szCs w:val="20"/>
-        </w:rPr>
-      </w:pPr>
-      <w:r>
-        <w:rPr>
-          <w:b/>
-          <w:bCs/>
-          <w:sz w:val="28"/>
-          <w:szCs w:val="20"/>
-        </w:rPr>
-        <w:t xml:space="preserve">Instrucciones: </w:t>
-      </w:r>
-    </w:p>
-    <w:p>
-      <w:pPr>
-        <w:spacing w:after="160"/>
-        <w:ind w:left="0"/>
-        <w:rPr>
-          <w:sz w:val="24"/>
-          <w:szCs w:val="18"/>
-          <w:lang w:val="es-CR"/>
-        </w:rPr>
-      </w:pPr>
-      <w:r>
-        <w:rPr>
-          <w:sz w:val="24"/>
-          <w:szCs w:val="18"/>
-          <w:lang w:val="es-CR"/>
-        </w:rPr>
-        <w:t xml:space="preserve">Durante la clase, el estudiante deberá completar el </w:t>
-      </w:r>
-      <w:r>
-        <w:rPr>
-          <w:b/>
-          <w:bCs/>
-          <w:sz w:val="24"/>
-          <w:szCs w:val="18"/>
-          <w:lang w:val="es-CR"/>
-        </w:rPr>
-        <w:t>Notebook 01 – Introducción a Python</w:t>
-      </w:r>
-      <w:r>
-        <w:rPr>
-          <w:sz w:val="24"/>
-          <w:szCs w:val="18"/>
-          <w:lang w:val="es-CR"/>
-        </w:rPr>
-        <w:t>, resolviendo las actividades indicadas en las celdas correspondientes.</w:t>
-      </w:r>
-    </w:p>
-    <w:p>
-      <w:pPr>
-        <w:spacing w:after="160"/>
-        <w:ind w:left="0"/>
-        <w:rPr>
-          <w:sz w:val="24"/>
-          <w:szCs w:val="18"/>
-          <w:lang w:val="es-CR"/>
-        </w:rPr>
-      </w:pPr>
-      <w:r>
-        <w:rPr>
-          <w:sz w:val="24"/>
-          <w:szCs w:val="18"/>
-          <w:lang w:val="es-CR"/>
-        </w:rPr>
-        <w:t>El notebook debe quedar completo, con el código ejecutado y las respuestas solicitadas.</w:t>
-      </w:r>
+      </w:pPr>
     </w:p>
     <w:p>
       <w:pPr>
@@ -409,6 +346,7 @@
           <w14:ligatures w14:val="none"/>
         </w:rPr>
       </w:pPr>
+      <w:proofErr w:type="gramStart"/>
       <w:r>
         <w:rPr>
           <w:rFonts w:asciiTheme="minorHAnsi" w:eastAsia="Times New Roman" w:hAnsiTheme="minorHAnsi" w:cs="Times New Roman"/>
@@ -431,6 +369,7 @@
         </w:rPr>
         <w:t>.ipynb</w:t>
       </w:r>
+      <w:proofErr w:type="gramEnd"/>
       <w:r>
         <w:rPr>
           <w:rFonts w:asciiTheme="minorHAnsi" w:eastAsia="Times New Roman" w:hAnsiTheme="minorHAnsi" w:cs="Times New Roman"/>
@@ -920,7 +859,7 @@
 <w:numbering xmlns:wpc="http://schemas.microsoft.com/office/word/2010/wordprocessingCanvas" xmlns:cx="http://schemas.microsoft.com/office/drawing/2014/chartex" xmlns:cx1="http://schemas.microsoft.com/office/drawing/2015/9/8/chartex" xmlns:cx2="http://schemas.microsoft.com/office/drawing/2015/10/21/chartex" xmlns:cx3="http://schemas.microsoft.com/office/drawing/2016/5/9/chartex" xmlns:cx4="http://schemas.microsoft.com/office/drawing/2016/5/10/chartex" xmlns:cx5="http://schemas.microsoft.com/office/drawing/2016/5/11/chartex" xmlns:cx6="http://schemas.microsoft.com/office/drawing/2016/5/12/chartex" xmlns:cx7="http://schemas.microsoft.com/office/drawing/2016/5/13/chartex" xmlns:cx8="http://schemas.microsoft.com/office/drawing/2016/5/14/chartex" xmlns:mc="http://schemas.openxmlformats.org/markup-compatibility/2006" xmlns:aink="http://schemas.microsoft.com/office/drawing/2016/ink" xmlns:am3d="http://schemas.microsoft.com/office/drawing/2017/model3d" xmlns:o="urn:schemas-microsoft-com:office:office" xmlns:oel="http://schemas.microsoft.com/office/2019/extlst" xmlns:r="http://schemas.openxmlformats.org/officeDocument/2006/relationships" xmlns:m="http://schemas.openxmlformats.org/officeDocument/2006/math" xmlns:v="urn:schemas-microsoft-com:vml" xmlns:wp14="http://schemas.microsoft.com/office/word/2010/wordprocessingDrawing" xmlns:wp="http://schemas.openxmlformats.org/drawingml/2006/wordprocessingDrawing" xmlns:w10="urn:schemas-microsoft-com:office:word" xmlns:w="http://schemas.openxmlformats.org/wordprocessingml/2006/main" xmlns:w14="http://schemas.microsoft.com/office/word/2010/wordml" xmlns:w15="http://schemas.microsoft.com/office/word/2012/wordml" xmlns:w16cex="http://schemas.microsoft.com/office/word/2018/wordml/cex" xmlns:w16cid="http://schemas.microsoft.com/office/word/2016/wordml/cid" xmlns:w16="http://schemas.microsoft.com/office/word/2018/wordml" xmlns:w16du="http://schemas.microsoft.com/office/word/2023/wordml/word16du" xmlns:w16sdtdh="http://schemas.microsoft.com/office/word/2020/wordml/sdtdatahash" xmlns:w16sdtfl="http://schemas.microsoft.com/office/word/2024/wordml/sdtformatlock" xmlns:w16se="http://schemas.microsoft.com/office/word/2015/wordml/symex" xmlns:wpg="http://schemas.microsoft.com/office/word/2010/wordprocessingGroup" xmlns:wpi="http://schemas.microsoft.com/office/word/2010/wordprocessingInk" xmlns:wne="http://schemas.microsoft.com/office/word/2006/wordml" xmlns:wps="http://schemas.microsoft.com/office/word/2010/wordprocessingShape" mc:Ignorable="w14 w15 w16se w16cid w16 w16cex w16sdtdh w16sdtfl w16du wp14">
   <w:numPicBullet w:numPicBulletId="0">
     <w:pict>
-      <v:rect id="_x0000_i1026" style="width:0;height:1.5pt" o:bullet="t" o:hrstd="t" o:hr="t" fillcolor="#a0a0a0" stroked="f"/>
+      <v:rect id="_x0000_i1029" style="width:0;height:1.5pt" o:bullet="t" o:hrstd="t" o:hr="t" fillcolor="#a0a0a0" stroked="f"/>
     </w:pict>
   </w:numPicBullet>
   <w:abstractNum w:abstractNumId="0" w15:restartNumberingAfterBreak="0">

</xml_diff>